<commit_message>
Atualiza relatorio da entrega
</commit_message>
<xml_diff>
--- a/Implementacao_I_preenchido.docx
+++ b/Implementacao_I_preenchido.docx
@@ -447,7 +447,7 @@
               <w:rPr>
                 <w:sz w:val="19"/>
               </w:rPr>
-              <w:t>Chat com LLM (Gemini gratuito ou Claude, escolhido pela chave disponível), regras éticas e prioridade de risco (P9). Código e prompt prontos; falta o teste ponta a ponta com modelo real (sem chave de API até aqui)</w:t>
+              <w:t>Chat com LLM (Gemini gratuito ou Claude, escolhido pela chave disponível), regras éticas e prioridade de risco (P9). Testado com o Gemini em 13 casos (as 10 perguntas da base e 3 casos especiais), respondendo em 2 a 4 segundos</w:t>
             </w:r>
           </w:p>
         </w:tc>
@@ -465,7 +465,7 @@
               <w:rPr>
                 <w:sz w:val="19"/>
               </w:rPr>
-              <w:t>☐ Concluída ☒ Parcial</w:t>
+              <w:t>☒ Concluída ☐ Parcial</w:t>
             </w:r>
           </w:p>
         </w:tc>
@@ -523,7 +523,7 @@
               <w:rPr>
                 <w:sz w:val="19"/>
               </w:rPr>
-              <w:t>Integração chat → simulador: linha [SIMULAR ...], resumo calculado em Python e botão "Abrir no simulador". Verificada com resposta simulada; o comportamento do modelo real ainda não foi testado</w:t>
+              <w:t>Integração chat → simulador: linha [SIMULAR ...], resumo calculado em Python e botão "Abrir no simulador". Com o Gemini real, o caso do campeonato gerou a linha [SIMULAR] correta e o resumo foi calculado em Python</w:t>
             </w:r>
           </w:p>
         </w:tc>
@@ -541,7 +541,7 @@
               <w:rPr>
                 <w:sz w:val="19"/>
               </w:rPr>
-              <w:t>☐ Concluída ☒ Parcial</w:t>
+              <w:t>☒ Concluída ☐ Parcial</w:t>
             </w:r>
           </w:p>
         </w:tc>
@@ -599,7 +599,7 @@
               <w:rPr>
                 <w:sz w:val="19"/>
               </w:rPr>
-              <w:t>Publicação do código: repositório git com commit local; envio ao GitHub pendente (GitHub CLI indisponível no ambiente)</w:t>
+              <w:t>Publicação: código no GitHub e app publicado no Streamlit Community Cloud (link público)</w:t>
             </w:r>
           </w:p>
         </w:tc>
@@ -617,7 +617,7 @@
               <w:rPr>
                 <w:sz w:val="19"/>
               </w:rPr>
-              <w:t>☐ Concluída ☒ Parcial</w:t>
+              <w:t>☒ Concluída ☐ Parcial</w:t>
             </w:r>
           </w:p>
         </w:tc>
@@ -868,7 +868,7 @@
           <w:i/>
           <w:sz w:val="18"/>
         </w:rPr>
-        <w:t>Figura 2 — Chat → gatilho: a linha [SIMULAR ...] foi removida do texto e o resumo foi calculado em Python. Atenção: nesta captura a resposta do modelo é SIMULADA (um LLM falso, só para demonstrar a integração), pois não havia chave de API.</w:t>
+        <w:t>Figura 2 — Chat → gatilho: a linha [SIMULAR ...] foi removida do texto e o resumo foi calculado em Python. Atenção: nesta captura a resposta do modelo é SIMULADA (um LLM falso, só para demonstrar a interface); o teste com o modelo real está descrito em 2.4.</w:t>
       </w:r>
     </w:p>
     <w:p>
@@ -1651,7 +1651,7 @@
           <w:i w:val="0"/>
           <w:sz w:val="20"/>
         </w:rPr>
-        <w:t>Cobertura dos testes: exemplo do Conteúdo IV (prob. implícita 55,56%, VE −R$ 5,00 por aposta, −R$ 260 no total, R$ 2.600 apostados), média simulada próxima do VE analítico, mesma semente → mesmo resultado, casos p = 0 e p = 1, saldo insuficiente, martingale, percentual da banca, custo de oportunidade, entradas inválidas bloqueadas e leitura da linha [SIMULAR]. O chat com modelo real não foi testado (roteiro em tests/roteiro_teste_chat.md).</w:t>
+        <w:t>Cobertura dos testes: exemplo do Conteúdo IV (prob. implícita 55,56%, VE −R$ 5,00 por aposta, −R$ 260 no total, R$ 2.600 apostados), média simulada próxima do VE analítico, mesma semente → mesmo resultado, casos p = 0 e p = 1, saldo insuficiente, martingale, percentual da banca, custo de oportunidade, entradas inválidas bloqueadas e leitura da linha [SIMULAR]. O chat foi testado com o Gemini real em 13 casos (roteiro em tests/roteiro_teste_chat.md; respostas em tests/saida_teste_chat.md).</w:t>
       </w:r>
     </w:p>
     <w:p>
@@ -1776,7 +1776,7 @@
         <w:t>Uso do Gemini gratuito.</w:t>
       </w:r>
       <w:r>
-        <w:t xml:space="preserve"> Para a solução funcionar sem custo, o chat usa o Gemini (camada gratuita) quando existe GEMINI_API_KEY, e o Claude (Haiku) quando existe ANTHROPIC_API_KEY. O modelo padrão do Gemini (gemini-3.8-flash) foi conferido na documentação do Google em 09/10/2026; como os nomes mudam com frequência, o modelo pode ser trocado pela variável MODELO sem mexer no código. A camada gratuita tem limite de uso e a qualidade das respostas pode diferir entre os dois modelos.</w:t>
+        <w:t xml:space="preserve"> Para a solução funcionar sem custo, o chat usa o Gemini (camada gratuita) quando existe GEMINI_API_KEY, e o Claude (Haiku) quando existe ANTHROPIC_API_KEY. Na publicação, o modelo mais novo (gemini-3.8-flash) demorou de 20 a 100 segundos e muitas vezes retornou erro 503 (alta demanda). O app passou a usar o gemini-3.5-flash-lite (2 a 4 segundos), com o 3.6 e o 3.7 como reserva e limite de tempo por tentativa. O modelo pode ser trocado pela variável MODELO sem mexer no código. A camada gratuita tem limite de uso e a qualidade pode diferir entre os modelos.</w:t>
       </w:r>
     </w:p>
     <w:p>
@@ -1791,10 +1791,10 @@
         <w:rPr>
           <w:b/>
         </w:rPr>
-        <w:t>Teste do chat.</w:t>
+        <w:t>Fidelidade das respostas.</w:t>
       </w:r>
       <w:r>
-        <w:t xml:space="preserve"> Sem chave de API no ambiente de desenvolvimento, o chat não foi testado com um modelo real; só o fluxo ao redor foi verificado (com uma resposta simulada). Isso é a principal pendência desta entrega.</w:t>
+        <w:t xml:space="preserve"> As respostas do modelo são texto gerado: o grupo ainda precisa ler as 10 respostas e compará-las com as fichas do Conteúdo III.</w:t>
       </w:r>
     </w:p>
     <w:p>
@@ -1848,7 +1848,7 @@
         <w:t>Publicação.</w:t>
       </w:r>
       <w:r>
-        <w:t xml:space="preserve"> Como o git e o GitHub CLI não estavam instalados na máquina, o repositório foi inicializado e o commit feito com uma biblioteca Python (dulwich), gerando um repositório git comum; o envio ao GitHub ficou pendente.</w:t>
+        <w:t xml:space="preserve"> Como o git e o GitHub CLI não estavam instalados na máquina, o commit inicial foi feito com uma biblioteca Python (dulwich), gerando um repositório git comum; o envio ao GitHub foi feito pelo GitHub Desktop e o app foi publicado no Streamlit Community Cloud, com a chave da API guardada nos Secrets (fora do código).</w:t>
       </w:r>
     </w:p>
     <w:p>
@@ -1987,7 +1987,7 @@
               <w:rPr>
                 <w:sz w:val="18"/>
               </w:rPr>
-              <w:t>Testar o chat com modelo real: as 10 perguntas, "qual time ganha domingo?", o caso de perseguição de perdas (deve priorizar a P9, sem simulador) e o cenário de R$ 20 / odd 2,20 / 40%; ajustar o prompt se algo falhar</w:t>
+              <w:t>Revisar as respostas do chat (tests/saida_teste_chat.md) contra as fichas do Conteúdo III e ajustar o prompt se algo estiver fora; repetir o teste após qualquer mudança</w:t>
             </w:r>
           </w:p>
         </w:tc>
@@ -2026,7 +2026,7 @@
               <w:rPr>
                 <w:sz w:val="18"/>
               </w:rPr>
-              <w:t>Criar a chave gratuita do Gemini (aistudio.google.com), colocar em .streamlit/secrets.toml, seguir tests/roteiro_teste_chat.md e registrar os resultados</w:t>
+              <w:t>Ler cada resposta ao lado da ficha correspondente, anotar divergências e, se preciso, ajustar prompt_sistema.md</w:t>
             </w:r>
           </w:p>
         </w:tc>
@@ -2203,7 +2203,7 @@
               <w:rPr>
                 <w:sz w:val="18"/>
               </w:rPr>
-              <w:t>Publicar no GitHub e colar o link na seção "Link da solução"</w:t>
+              <w:t>Colar o link do repositório e do app publicado na seção "Link da solução" e reenviar as últimas mudanças (modelo mais rápido) ao GitHub</w:t>
             </w:r>
           </w:p>
         </w:tc>
@@ -2242,7 +2242,7 @@
               <w:rPr>
                 <w:sz w:val="18"/>
               </w:rPr>
-              <w:t>Criar o repositório, fazer o push (git push) do commit já pronto e atualizar este relatório</w:t>
+              <w:t>No GitHub Desktop, fazer commit e Push origin; conferir que o app no Streamlit atualizou e testar o chat pelo link</w:t>
             </w:r>
           </w:p>
         </w:tc>
@@ -2490,7 +2490,7 @@
               <w:spacing w:after="0"/>
             </w:pPr>
             <w:r>
-              <w:t>☐</w:t>
+              <w:t>☒</w:t>
             </w:r>
           </w:p>
         </w:tc>
@@ -2504,7 +2504,7 @@
               <w:spacing w:after="0"/>
             </w:pPr>
             <w:r>
-              <w:t>☒</w:t>
+              <w:t>☐</w:t>
             </w:r>
           </w:p>
         </w:tc>
@@ -2673,7 +2673,7 @@
               <w:spacing w:after="0"/>
             </w:pPr>
             <w:r>
-              <w:t>☐</w:t>
+              <w:t>☒</w:t>
             </w:r>
           </w:p>
         </w:tc>
@@ -2687,7 +2687,7 @@
               <w:spacing w:after="0"/>
             </w:pPr>
             <w:r>
-              <w:t>☒</w:t>
+              <w:t>☐</w:t>
             </w:r>
           </w:p>
         </w:tc>
@@ -2783,7 +2783,7 @@
           <w:i w:val="0"/>
           <w:sz w:val="20"/>
         </w:rPr>
-        <w:t>Justificativas: o assistente responde às perguntas previstas e a integração está "Parcial" porque o fluxo ao redor do modelo foi testado, mas o chat ainda não foi executado com um modelo real. A base está integrada (carregada inteira no prompt de sistema). O simulador está funcionando e coberto por testes. A solução está "Parcial" para a próxima etapa por causa dessa pendência e das entrevistas, da consulta ao professor e da reconfirmação do dado da SPA.</w:t>
+        <w:t>Justificativas: o chat foi testado com o Gemini real em 13 casos e respondeu como esperado, mas a conferência de cada resposta com as fichas ainda é do grupo. A base está integrada (carregada inteira no prompt de sistema) e o simulador está funcionando e coberto por testes. A solução está "Parcial" para a próxima etapa por causa das entrevistas, da consulta ao professor, da reconfirmação do dado da SPA e da revisão das respostas.</w:t>
       </w:r>
     </w:p>
     <w:p>

</xml_diff>

<commit_message>
Adiciona CLAUDE.md com notas do projeto e atualiza o relatorio
</commit_message>
<xml_diff>
--- a/Implementacao_I_preenchido.docx
+++ b/Implementacao_I_preenchido.docx
@@ -117,20 +117,7 @@
         <w:t>Link da solução (ou repositório):</w:t>
       </w:r>
       <w:r>
-        <w:t xml:space="preserve"> [COLAR LINK]</w:t>
-      </w:r>
-    </w:p>
-    <w:p>
-      <w:pPr>
-        <w:spacing w:after="80"/>
-      </w:pPr>
-      <w:r>
-        <w:rPr>
-          <w:b w:val="0"/>
-          <w:i/>
-          <w:sz w:val="18"/>
-        </w:rPr>
-        <w:t>(O repositório local já tem o commit pronto; o link será colado aqui depois de publicado no GitHub — veja as pendências na seção 3.)</w:t>
+        <w:t xml:space="preserve"> https://github.com/thomasdtavares/Projetos-Bets  |  Aplicativo no ar: [COLAR LINK DO APP]</w:t>
       </w:r>
     </w:p>
     <w:p>

</xml_diff>